<commit_message>
Reformat discharged-secrets package for Data & Policy (Cambridge UP)
Retarget the shared-micromobility lifecycle data-exposure submission from
Computers & Security to Data & Policy:
- author-date (Cambridge A) citations and alphabetised reference list
- 120-word Policy Significance Statement beneath the abstract
- required disclosure statements (data availability, funding, competing
  interests) plus author contributions/ethics/AI
- single-blind (non-anonymized) manuscript with title/author page
- <=250-word abstract, <=5 keywords; updated validation checks
- retargeted cover letter, checklist, and output filenames
- register the branch in sync-to-repos (BRANCH_MAP/SUBDIR_MAP)

Co-Authored-By: Tatsuki Onishi <bougtoir@gmail.com>
</commit_message>
<xml_diff>
--- a/discharged_secrets_ijcip/output/Reporting_Guideline_PRISMA-ScR.docx
+++ b/discharged_secrets_ijcip/output/Reporting_Guideline_PRISMA-ScR.docx
@@ -16,7 +16,7 @@
     </w:p>
     <w:p>
       <w:r>
-        <w:t>The scoping-review component (WP1) follows the PRISMA-ScR checklist [Tricco et al., 2018]. The field audit (WP2) and disclosure audit (WP3) are cross-sectional observational studies of public artefacts and are reported with explicit denominators, confidence intervals, and open code. The table below maps each PRISMA-ScR item to its location.</w:t>
+        <w:t>The scoping-review component (WP1) follows the PRISMA-ScR checklist (Tricco et al. 2018). The field audit (WP2) and disclosure audit (WP3) are cross-sectional observational studies of public artefacts and are reported with explicit denominators, confidence intervals, and open code. The table below maps each PRISMA-ScR item to its location.</w:t>
       </w:r>
     </w:p>
     <w:p>
@@ -478,7 +478,7 @@
                 <w:rFonts w:ascii="Arial" w:hAnsi="Arial"/>
                 <w:sz w:val="16"/>
               </w:rPr>
-              <w:t>Data and code availability</w:t>
+              <w:t>Data availability statement</w:t>
             </w:r>
           </w:p>
         </w:tc>

</xml_diff>

<commit_message>
Retarget submission package to Transport Policy (Elsevier)
- Update build_submission.py for Transport Policy: journal constants, highlights
  (3-5 bullets, <=85 chars), unstructured abstract, double-anonymized title page,
  updated cover letter, Harvard-style in-text citations, word count excluding
  title/abstract/references, and Transport Policy file naming.
- Update reproduce.py for Elsevier Harvard reference formatting and output file
  names.
- Add policy-implications section and strengthen policy framing in Introduction,
  Discussion, and cover letter to address Data & Policy desk-reject feedback.
- Update AUTHOR_GUIDELINES.md, README.md, REVIEWER_REVIEW.md, and
  sync-to-repos.yml for the new Transport Policy branch and exclusion map.

Co-Authored-By: Tatsuki Onishi <bougtoir@gmail.com>
</commit_message>
<xml_diff>
--- a/discharged_secrets_ijcip/output/Reporting_Guideline_PRISMA-ScR.docx
+++ b/discharged_secrets_ijcip/output/Reporting_Guideline_PRISMA-ScR.docx
@@ -16,7 +16,7 @@
     </w:p>
     <w:p>
       <w:r>
-        <w:t>The scoping-review component (WP1) follows the PRISMA-ScR checklist (Tricco et al. 2018). The field audit (WP2) and disclosure audit (WP3) are cross-sectional observational studies of public artefacts and are reported with explicit denominators, confidence intervals, and open code. The table below maps each PRISMA-ScR item to its location.</w:t>
+        <w:t>The scoping-review component (WP1) follows the PRISMA-ScR checklist (Tricco et al., 2018). The field audit (WP2) and disclosure audit (WP3) are cross-sectional observational studies of public artefacts and are reported with explicit denominators, confidence intervals, and open code. The table below maps each PRISMA-ScR item to its location.</w:t>
       </w:r>
     </w:p>
     <w:p>
@@ -232,7 +232,7 @@
                 <w:rFonts w:ascii="Arial" w:hAnsi="Arial"/>
                 <w:sz w:val="16"/>
               </w:rPr>
-              <w:t>Structured summary</w:t>
+              <w:t>Summary</w:t>
             </w:r>
           </w:p>
         </w:tc>

</xml_diff>